<commit_message>
Google search console meta tag
</commit_message>
<xml_diff>
--- a/Reni Weboldal indítás.docx
+++ b/Reni Weboldal indítás.docx
@@ -2424,7 +2424,13 @@
     </w:p>
     <w:p>
       <w:r>
-        <w:t>[ ] Repository és publikált fájlok átnézése titkos adatokért</w:t>
+        <w:t>[</w:t>
+      </w:r>
+      <w:r>
+        <w:t>x</w:t>
+      </w:r>
+      <w:r>
+        <w:t>] Repository és publikált fájlok átnézése titkos adatokért</w:t>
       </w:r>
     </w:p>
     <w:sectPr>

</xml_diff>